<commit_message>
Changed lab spec from word to pdf for easier viewing directly in vscode
</commit_message>
<xml_diff>
--- a/Lab2 node API backend.docx
+++ b/Lab2 node API backend.docx
@@ -7,7 +7,10 @@
         <w:pStyle w:val="Heading1"/>
       </w:pPr>
       <w:r>
-        <w:t>Lab 3 Static Web Server, App Server and Front-end integration</w:t>
+        <w:t xml:space="preserve">Lab </w:t>
+      </w:r>
+      <w:r>
+        <w:t>2: API Server</w:t>
       </w:r>
     </w:p>
     <w:p/>
@@ -213,11 +216,9 @@
       <w:r>
         <w:t xml:space="preserve">provided </w:t>
       </w:r>
-      <w:proofErr w:type="spellStart"/>
       <w:r>
         <w:t>priceListBackend</w:t>
       </w:r>
-      <w:proofErr w:type="spellEnd"/>
       <w:r>
         <w:t xml:space="preserve"> example</w:t>
       </w:r>
@@ -339,7 +340,6 @@
       <w:r>
         <w:t xml:space="preserve">in </w:t>
       </w:r>
-      <w:proofErr w:type="spellStart"/>
       <w:proofErr w:type="gramStart"/>
       <w:r>
         <w:rPr>
@@ -348,7 +348,6 @@
         </w:rPr>
         <w:t>jokes.json</w:t>
       </w:r>
-      <w:proofErr w:type="spellEnd"/>
       <w:proofErr w:type="gramEnd"/>
       <w:r>
         <w:rPr>
@@ -377,44 +376,28 @@
           <w:b/>
           <w:bCs/>
         </w:rPr>
-        <w:t>GET /</w:t>
-      </w:r>
-      <w:proofErr w:type="spellStart"/>
+        <w:t>GET /joke</w:t>
+      </w:r>
       <w:r>
         <w:rPr>
           <w:b/>
           <w:bCs/>
         </w:rPr>
-        <w:t>joke</w:t>
+        <w:t>s</w:t>
       </w:r>
       <w:r>
         <w:rPr>
           <w:b/>
           <w:bCs/>
         </w:rPr>
-        <w:t>s</w:t>
+        <w:t>?</w:t>
       </w:r>
       <w:r>
         <w:rPr>
           <w:b/>
           <w:bCs/>
         </w:rPr>
-        <w:t>?</w:t>
-      </w:r>
-      <w:r>
-        <w:rPr>
-          <w:b/>
-          <w:bCs/>
-        </w:rPr>
-        <w:t>type</w:t>
-      </w:r>
-      <w:proofErr w:type="spellEnd"/>
-      <w:r>
-        <w:rPr>
-          <w:b/>
-          <w:bCs/>
-        </w:rPr>
-        <w:t>={type}&amp;limit</w:t>
+        <w:t>type={type}&amp;limit</w:t>
       </w:r>
       <w:r>
         <w:rPr>
@@ -450,7 +433,6 @@
       <w:r>
         <w:t xml:space="preserve"> jokes of type </w:t>
       </w:r>
-      <w:proofErr w:type="spellStart"/>
       <w:r>
         <w:rPr>
           <w:b/>
@@ -460,7 +442,6 @@
         </w:rPr>
         <w:t>type</w:t>
       </w:r>
-      <w:proofErr w:type="spellEnd"/>
       <w:r>
         <w:t xml:space="preserve">. </w:t>
       </w:r>
@@ -522,77 +503,29 @@
           <w:b/>
           <w:bCs/>
         </w:rPr>
-        <w:t>GET /</w:t>
-      </w:r>
-      <w:proofErr w:type="spellStart"/>
+        <w:t>GET /jokes?</w:t>
+      </w:r>
       <w:r>
         <w:rPr>
           <w:b/>
           <w:bCs/>
         </w:rPr>
-        <w:t>jokes?</w:t>
+        <w:t>type=dad</w:t>
+      </w:r>
+      <w:r>
+        <w:t xml:space="preserve"> returns one dad joke randomly selected from the available list</w:t>
+      </w:r>
+    </w:p>
+    <w:p>
+      <w:r>
+        <w:t xml:space="preserve">e.g. </w:t>
       </w:r>
       <w:r>
         <w:rPr>
           <w:b/>
           <w:bCs/>
         </w:rPr>
-        <w:t>type</w:t>
-      </w:r>
-      <w:proofErr w:type="spellEnd"/>
-      <w:r>
-        <w:rPr>
-          <w:b/>
-          <w:bCs/>
-        </w:rPr>
-        <w:t>=dad</w:t>
-      </w:r>
-      <w:r>
-        <w:t xml:space="preserve"> returns one dad joke randomly selected from the available list</w:t>
-      </w:r>
-    </w:p>
-    <w:p>
-      <w:r>
-        <w:t xml:space="preserve">e.g. </w:t>
-      </w:r>
-      <w:r>
-        <w:rPr>
-          <w:b/>
-          <w:bCs/>
-        </w:rPr>
-        <w:t>GET /</w:t>
-      </w:r>
-      <w:proofErr w:type="spellStart"/>
-      <w:r>
-        <w:rPr>
-          <w:b/>
-          <w:bCs/>
-        </w:rPr>
-        <w:t>jokes?type</w:t>
-      </w:r>
-      <w:proofErr w:type="spellEnd"/>
-      <w:r>
-        <w:rPr>
-          <w:b/>
-          <w:bCs/>
-        </w:rPr>
-        <w:t>=</w:t>
-      </w:r>
-      <w:proofErr w:type="spellStart"/>
-      <w:r>
-        <w:rPr>
-          <w:b/>
-          <w:bCs/>
-        </w:rPr>
-        <w:t>programming&amp;limit</w:t>
-      </w:r>
-      <w:proofErr w:type="spellEnd"/>
-      <w:r>
-        <w:rPr>
-          <w:b/>
-          <w:bCs/>
-        </w:rPr>
-        <w:t>=10</w:t>
+        <w:t>GET /jokes?type=programming&amp;limit=10</w:t>
       </w:r>
       <w:r>
         <w:t xml:space="preserve"> returns 10 randomly selected programming jokes</w:t>
@@ -842,23 +775,12 @@
         <w:t>referenced</w:t>
       </w:r>
       <w:r>
-        <w:t xml:space="preserve"> </w:t>
-      </w:r>
-      <w:r>
-        <w:t>collection</w:t>
+        <w:t xml:space="preserve"> collection</w:t>
       </w:r>
     </w:p>
     <w:p>
       <w:r>
-        <w:t xml:space="preserve">Submit the joke as </w:t>
-      </w:r>
-      <w:proofErr w:type="spellStart"/>
-      <w:r>
-        <w:t>json</w:t>
-      </w:r>
-      <w:proofErr w:type="spellEnd"/>
-      <w:r>
-        <w:t xml:space="preserve"> with an id not already in the array</w:t>
+        <w:t>Submit the joke as json with an id not already in the array</w:t>
       </w:r>
       <w:r>
         <w:t>. Prove it works by requesting it by ID</w:t>

</xml_diff>